<commit_message>
Agregar slide general de contraprestaciones para VOIT y etiquetas en slides de detalle
</commit_message>
<xml_diff>
--- a/entregables/Presentacion VOIT 2026 - Contenido para Canva.docx
+++ b/entregables/Presentacion VOIT 2026 - Contenido para Canva.docx
@@ -33,7 +33,7 @@
         <w:rPr>
           <w:i/>
         </w:rPr>
-        <w:t xml:space="preserve">Cómo usar este documento: cada bloque es un slide. «Título» y «Título (parte destacada en color)» siguen el estilo de la presentación anterior (primera parte en blanco o azul y segunda parte en naranja). Las cifras destacadas pueden ir en tamaño grande. Toda la información proviene del documento «contraprestación voit 2026». Lo resaltado en amarillo está por confirmar.</w:t>
+        <w:t xml:space="preserve">Cómo usar este documento: cada bloque es un slide. «Título» y «Título (parte destacada en color)» siguen el estilo de la presentación anterior (primera parte en blanco o azul y segunda parte en naranja). Las cifras destacadas pueden ir en tamaño grande. El slide 2 presenta todas las contraprestaciones de forma general y los slides 3 a 12 las detallan; la «Etiqueta superior» indica a cuál contraprestación pertenece cada uno. Toda la información proviene del documento «contraprestación voit 2026». Lo resaltado en amarillo está por confirmar.</w:t>
       </w:r>
     </w:p>
     <w:p>
@@ -119,7 +119,7 @@
         <w:pStyle w:val="Heading1"/>
       </w:pPr>
       <w:r>
-        <w:t xml:space="preserve">Slide 2 · La alianza en una mirada</w:t>
+        <w:t xml:space="preserve">Slide 2 · Contraprestaciones para VOIT (slide general)</w:t>
       </w:r>
     </w:p>
     <w:p>
@@ -133,7 +133,7 @@
         <w:t xml:space="preserve">Título:</w:t>
       </w:r>
       <w:r>
-        <w:t xml:space="preserve"> LA ALIANZA</w:t>
+        <w:t xml:space="preserve"> CONTRAPRESTACIONES</w:t>
       </w:r>
     </w:p>
     <w:p>
@@ -147,7 +147,7 @@
         <w:t xml:space="preserve">Título (parte destacada en color):</w:t>
       </w:r>
       <w:r>
-        <w:t xml:space="preserve"> EN UNA MIRADA</w:t>
+        <w:t xml:space="preserve"> PARA VOIT</w:t>
       </w:r>
     </w:p>
     <w:p>
@@ -163,7 +163,7 @@
         <w:jc w:val="both"/>
       </w:pPr>
       <w:r>
-        <w:t xml:space="preserve">Una alianza integral que coloca a VOIT en la cancha, en el uniforme, en las redes y en los eventos de la Academia.</w:t>
+        <w:t xml:space="preserve">Durante la vigencia del convenio, la Academia de Fútbol Andrés Chitiva otorgará a VOIT las siguientes contraprestaciones:</w:t>
       </w:r>
     </w:p>
     <w:p>
@@ -186,82 +186,279 @@
         <w:rPr>
           <w:b/>
         </w:rPr>
-        <w:t xml:space="preserve">Exclusividad de categoría:</w:t>
-      </w:r>
-      <w:r>
-        <w:t xml:space="preserve"> VOIT, balón único y oficial de la Academia y de Liga Chitiva.</w:t>
-      </w:r>
-    </w:p>
-    <w:p>
-      <w:pPr>
-        <w:pStyle w:val="ListBullet"/>
-        <w:numPr>
-          <w:ilvl w:val="0"/>
-          <w:numId w:val="1"/>
-        </w:numPr>
-      </w:pPr>
-      <w:r>
-        <w:rPr>
-          <w:b/>
-        </w:rPr>
-        <w:t xml:space="preserve">Publicidad perimetral:</w:t>
-      </w:r>
-      <w:r>
-        <w:t xml:space="preserve"> 3 vallas con 76.74 m² en las Canchas 1 y 3.</w:t>
-      </w:r>
-    </w:p>
-    <w:p>
-      <w:pPr>
-        <w:pStyle w:val="ListBullet"/>
-        <w:numPr>
-          <w:ilvl w:val="0"/>
-          <w:numId w:val="1"/>
-        </w:numPr>
-      </w:pPr>
-      <w:r>
-        <w:rPr>
-          <w:b/>
-        </w:rPr>
-        <w:t xml:space="preserve">Branding en uniformes:</w:t>
-      </w:r>
-      <w:r>
-        <w:t xml:space="preserve"> logotipo VOIT en la playera de todos los alumnos.</w:t>
-      </w:r>
-    </w:p>
-    <w:p>
-      <w:pPr>
-        <w:pStyle w:val="ListBullet"/>
-        <w:numPr>
-          <w:ilvl w:val="0"/>
-          <w:numId w:val="1"/>
-        </w:numPr>
-      </w:pPr>
-      <w:r>
-        <w:rPr>
-          <w:b/>
-        </w:rPr>
-        <w:t xml:space="preserve">Contenido digital:</w:t>
-      </w:r>
-      <w:r>
-        <w:t xml:space="preserve"> 10 contenidos mínimos al mes en Instagram, Facebook y TikTok.</w:t>
-      </w:r>
-    </w:p>
-    <w:p>
-      <w:pPr>
-        <w:pStyle w:val="ListBullet"/>
-        <w:numPr>
-          <w:ilvl w:val="0"/>
-          <w:numId w:val="1"/>
-        </w:numPr>
-      </w:pPr>
-      <w:r>
-        <w:rPr>
-          <w:b/>
-        </w:rPr>
-        <w:t xml:space="preserve">Eventos y denominación oficial:</w:t>
-      </w:r>
-      <w:r>
-        <w:t xml:space="preserve"> presencia de marca y activaciones sin costo de espacio.</w:t>
+        <w:t xml:space="preserve">1. Exclusividad de categoría</w:t>
+      </w:r>
+    </w:p>
+    <w:p>
+      <w:pPr>
+        <w:pStyle w:val="ListBullet"/>
+        <w:numPr>
+          <w:ilvl w:val="1"/>
+          <w:numId w:val="1"/>
+        </w:numPr>
+      </w:pPr>
+      <w:r>
+        <w:t xml:space="preserve">VOIT, marca única y exclusiva de balones de fútbol de la Academia y Liga Chitiva.</w:t>
+      </w:r>
+    </w:p>
+    <w:p>
+      <w:pPr>
+        <w:pStyle w:val="ListBullet"/>
+        <w:numPr>
+          <w:ilvl w:val="1"/>
+          <w:numId w:val="1"/>
+        </w:numPr>
+      </w:pPr>
+      <w:r>
+        <w:t xml:space="preserve">Balón oficial de juego de Liga Chitiva en todas sus categorías.</w:t>
+      </w:r>
+    </w:p>
+    <w:p>
+      <w:pPr>
+        <w:pStyle w:val="ListBullet"/>
+        <w:numPr>
+          <w:ilvl w:val="0"/>
+          <w:numId w:val="1"/>
+        </w:numPr>
+      </w:pPr>
+      <w:r>
+        <w:rPr>
+          <w:b/>
+        </w:rPr>
+        <w:t xml:space="preserve">2. Publicidad perimetral</w:t>
+      </w:r>
+    </w:p>
+    <w:p>
+      <w:pPr>
+        <w:pStyle w:val="ListBullet"/>
+        <w:numPr>
+          <w:ilvl w:val="1"/>
+          <w:numId w:val="1"/>
+        </w:numPr>
+      </w:pPr>
+      <w:r>
+        <w:t xml:space="preserve">3 vallas VOIT en las Canchas 1 y 3: 76.74 m².</w:t>
+      </w:r>
+    </w:p>
+    <w:p>
+      <w:pPr>
+        <w:pStyle w:val="ListBullet"/>
+        <w:numPr>
+          <w:ilvl w:val="1"/>
+          <w:numId w:val="1"/>
+        </w:numPr>
+      </w:pPr>
+      <w:r>
+        <w:t xml:space="preserve">Incluye 1 de las 2 posiciones de Gran Formato del Complejo.</w:t>
+      </w:r>
+    </w:p>
+    <w:p>
+      <w:pPr>
+        <w:pStyle w:val="ListBullet"/>
+        <w:numPr>
+          <w:ilvl w:val="0"/>
+          <w:numId w:val="1"/>
+        </w:numPr>
+      </w:pPr>
+      <w:r>
+        <w:rPr>
+          <w:b/>
+        </w:rPr>
+        <w:t xml:space="preserve">3. Branding en uniformes</w:t>
+      </w:r>
+    </w:p>
+    <w:p>
+      <w:pPr>
+        <w:pStyle w:val="ListBullet"/>
+        <w:numPr>
+          <w:ilvl w:val="1"/>
+          <w:numId w:val="1"/>
+        </w:numPr>
+      </w:pPr>
+      <w:r>
+        <w:t xml:space="preserve">Logotipo VOIT en la playera oficial de todos los alumnos.</w:t>
+      </w:r>
+    </w:p>
+    <w:p>
+      <w:pPr>
+        <w:pStyle w:val="ListBullet"/>
+        <w:numPr>
+          <w:ilvl w:val="0"/>
+          <w:numId w:val="1"/>
+        </w:numPr>
+      </w:pPr>
+      <w:r>
+        <w:rPr>
+          <w:b/>
+        </w:rPr>
+        <w:t xml:space="preserve">4. Contenido digital</w:t>
+      </w:r>
+    </w:p>
+    <w:p>
+      <w:pPr>
+        <w:pStyle w:val="ListBullet"/>
+        <w:numPr>
+          <w:ilvl w:val="1"/>
+          <w:numId w:val="1"/>
+        </w:numPr>
+      </w:pPr>
+      <w:r>
+        <w:t xml:space="preserve">10 contenidos mínimos al mes con el balón VOIT en Instagram, Facebook y TikTok.</w:t>
+      </w:r>
+    </w:p>
+    <w:p>
+      <w:pPr>
+        <w:pStyle w:val="ListBullet"/>
+        <w:numPr>
+          <w:ilvl w:val="1"/>
+          <w:numId w:val="1"/>
+        </w:numPr>
+      </w:pPr>
+      <w:r>
+        <w:t xml:space="preserve">Etiquetado a @voitmx y derecho de VOIT a republicar.</w:t>
+      </w:r>
+    </w:p>
+    <w:p>
+      <w:pPr>
+        <w:pStyle w:val="ListBullet"/>
+        <w:numPr>
+          <w:ilvl w:val="0"/>
+          <w:numId w:val="1"/>
+        </w:numPr>
+      </w:pPr>
+      <w:r>
+        <w:rPr>
+          <w:b/>
+        </w:rPr>
+        <w:t xml:space="preserve">5. Denominación oficial, eventos y activaciones</w:t>
+      </w:r>
+    </w:p>
+    <w:p>
+      <w:pPr>
+        <w:pStyle w:val="ListBullet"/>
+        <w:numPr>
+          <w:ilvl w:val="1"/>
+          <w:numId w:val="1"/>
+        </w:numPr>
+      </w:pPr>
+      <w:r>
+        <w:t xml:space="preserve">Patrocinador Oficial de Equipamiento Deportivo de la Academia.</w:t>
+      </w:r>
+    </w:p>
+    <w:p>
+      <w:pPr>
+        <w:pStyle w:val="ListBullet"/>
+        <w:numPr>
+          <w:ilvl w:val="1"/>
+          <w:numId w:val="1"/>
+        </w:numPr>
+      </w:pPr>
+      <w:r>
+        <w:t xml:space="preserve">Presencia en clínicas, visorías, ruedas de prensa y Liga Chitiva.</w:t>
+      </w:r>
+    </w:p>
+    <w:p>
+      <w:pPr>
+        <w:pStyle w:val="ListBullet"/>
+        <w:numPr>
+          <w:ilvl w:val="1"/>
+          <w:numId w:val="1"/>
+        </w:numPr>
+      </w:pPr>
+      <w:r>
+        <w:t xml:space="preserve">Activaciones presenciales sin costo por uso de espacio.</w:t>
+      </w:r>
+    </w:p>
+    <w:p>
+      <w:pPr>
+        <w:spacing w:after="80"/>
+      </w:pPr>
+      <w:r>
+        <w:rPr>
+          <w:b/>
+        </w:rPr>
+        <w:t xml:space="preserve">Frase de cierre (cursiva):</w:t>
+      </w:r>
+      <w:r>
+        <w:t xml:space="preserve"> «Cada contraprestación se detalla en los siguientes slides.»</w:t>
+      </w:r>
+    </w:p>
+    <w:p>
+      <w:pPr>
+        <w:spacing w:after="80"/>
+      </w:pPr>
+      <w:r>
+        <w:rPr>
+          <w:b/>
+        </w:rPr>
+        <w:t xml:space="preserve">Imagen sugerida:</w:t>
+      </w:r>
+      <w:r>
+        <w:t xml:space="preserve"> Columna de color con el título y cinco bloques numerados (como el slide «Contraprestaciones para Voit» de la presentación anterior), o cinco íconos: balón, valla, playera, celular y micrófono.</w:t>
+      </w:r>
+    </w:p>
+    <w:p>
+      <w:pPr>
+        <w:pStyle w:val="Heading1"/>
+      </w:pPr>
+      <w:r>
+        <w:t xml:space="preserve">Slide 3 · Exclusividad de categoría</w:t>
+      </w:r>
+    </w:p>
+    <w:p>
+      <w:pPr>
+        <w:spacing w:after="80"/>
+      </w:pPr>
+      <w:r>
+        <w:rPr>
+          <w:b/>
+        </w:rPr>
+        <w:t xml:space="preserve">Etiqueta superior (texto pequeño):</w:t>
+      </w:r>
+      <w:r>
+        <w:t xml:space="preserve"> Contraprestación 1 · Exclusividad de categoría</w:t>
+      </w:r>
+    </w:p>
+    <w:p>
+      <w:pPr>
+        <w:spacing w:after="80"/>
+      </w:pPr>
+      <w:r>
+        <w:rPr>
+          <w:b/>
+        </w:rPr>
+        <w:t xml:space="preserve">Título:</w:t>
+      </w:r>
+      <w:r>
+        <w:t xml:space="preserve"> EXCLUSIVIDAD</w:t>
+      </w:r>
+    </w:p>
+    <w:p>
+      <w:pPr>
+        <w:spacing w:after="80"/>
+      </w:pPr>
+      <w:r>
+        <w:rPr>
+          <w:b/>
+        </w:rPr>
+        <w:t xml:space="preserve">Título (parte destacada en color):</w:t>
+      </w:r>
+      <w:r>
+        <w:t xml:space="preserve"> DE CATEGORÍA</w:t>
+      </w:r>
+    </w:p>
+    <w:p>
+      <w:pPr>
+        <w:spacing w:after="80"/>
+      </w:pPr>
+      <w:r>
+        <w:rPr>
+          <w:b/>
+        </w:rPr>
+        <w:t xml:space="preserve">Subtítulo:</w:t>
+      </w:r>
+      <w:r>
+        <w:t xml:space="preserve"> VOIT, el único balón de la Academia y de Liga Chitiva</w:t>
       </w:r>
     </w:p>
     <w:p>
@@ -269,26 +466,85 @@
         <w:pStyle w:val="Heading3"/>
       </w:pPr>
       <w:r>
-        <w:t xml:space="preserve">Cifras destacadas</w:t>
-      </w:r>
-    </w:p>
-    <w:p>
-      <w:pPr>
-        <w:pStyle w:val="ListBullet"/>
-        <w:numPr>
-          <w:ilvl w:val="0"/>
-          <w:numId w:val="1"/>
-        </w:numPr>
-      </w:pPr>
-      <w:r>
-        <w:t xml:space="preserve">Vigencia propuesta: 6 meses </w:t>
-      </w:r>
-      <w:r>
-        <w:rPr>
-          <w:b/>
-          <w:highlight w:val="yellow"/>
-        </w:rPr>
-        <w:t xml:space="preserve">[POR CONFIRMAR]</w:t>
+        <w:t xml:space="preserve">Texto</w:t>
+      </w:r>
+    </w:p>
+    <w:p>
+      <w:pPr>
+        <w:jc w:val="both"/>
+      </w:pPr>
+      <w:r>
+        <w:t xml:space="preserve">Durante la vigencia del convenio, VOIT será la marca única y exclusiva de balones de fútbol utilizada y promovida oficialmente por la Academia y Liga Chitiva dentro del Complejo Deportivo Andrés Chitiva.</w:t>
+      </w:r>
+    </w:p>
+    <w:p>
+      <w:pPr>
+        <w:pStyle w:val="Heading3"/>
+      </w:pPr>
+      <w:r>
+        <w:t xml:space="preserve">Viñetas</w:t>
+      </w:r>
+    </w:p>
+    <w:p>
+      <w:pPr>
+        <w:pStyle w:val="ListBullet"/>
+        <w:numPr>
+          <w:ilvl w:val="0"/>
+          <w:numId w:val="1"/>
+        </w:numPr>
+      </w:pPr>
+      <w:r>
+        <w:t xml:space="preserve">Balón exclusivo en entrenamientos, partidos, visorías, clínicas, torneos y eventos oficiales.</w:t>
+      </w:r>
+    </w:p>
+    <w:p>
+      <w:pPr>
+        <w:pStyle w:val="ListBullet"/>
+        <w:numPr>
+          <w:ilvl w:val="0"/>
+          <w:numId w:val="1"/>
+        </w:numPr>
+      </w:pPr>
+      <w:r>
+        <w:t xml:space="preserve">Balón oficial de juego de Liga Chitiva en todas sus categorías.</w:t>
+      </w:r>
+    </w:p>
+    <w:p>
+      <w:pPr>
+        <w:pStyle w:val="ListBullet"/>
+        <w:numPr>
+          <w:ilvl w:val="0"/>
+          <w:numId w:val="1"/>
+        </w:numPr>
+      </w:pPr>
+      <w:r>
+        <w:t xml:space="preserve">Sin balones de marcas competidoras en actividades oficiales, redes sociales ni material publicitario.</w:t>
+      </w:r>
+    </w:p>
+    <w:p>
+      <w:pPr>
+        <w:pStyle w:val="ListBullet"/>
+        <w:numPr>
+          <w:ilvl w:val="0"/>
+          <w:numId w:val="1"/>
+        </w:numPr>
+      </w:pPr>
+      <w:r>
+        <w:t xml:space="preserve">Sin convenios de patrocinio, canje, publicidad o proveeduría con marcas competidoras de balones.</w:t>
+      </w:r>
+    </w:p>
+    <w:p>
+      <w:pPr>
+        <w:spacing w:after="80"/>
+      </w:pPr>
+      <w:r>
+        <w:rPr>
+          <w:b/>
+        </w:rPr>
+        <w:t xml:space="preserve">Frase de cierre (cursiva):</w:t>
+      </w:r>
+      <w:r>
+        <w:t xml:space="preserve"> «La exclusividad podrá ampliarse a otras líneas de producto mediante acuerdo por escrito.»</w:t>
       </w:r>
     </w:p>
     <w:p>
@@ -302,7 +558,7 @@
         <w:t xml:space="preserve">Imagen sugerida:</w:t>
       </w:r>
       <w:r>
-        <w:t xml:space="preserve"> Cinco íconos o tarjetas, una por cada frente de la alianza.</w:t>
+        <w:t xml:space="preserve"> Balón VOIT en primer plano durante un partido o entrenamiento.</w:t>
       </w:r>
     </w:p>
     <w:p>
@@ -310,157 +566,21 @@
         <w:pStyle w:val="Heading1"/>
       </w:pPr>
       <w:r>
-        <w:t xml:space="preserve">Slide 3 · Exclusividad de categoría</w:t>
-      </w:r>
-    </w:p>
-    <w:p>
-      <w:pPr>
-        <w:spacing w:after="80"/>
-      </w:pPr>
-      <w:r>
-        <w:rPr>
-          <w:b/>
-        </w:rPr>
-        <w:t xml:space="preserve">Título:</w:t>
-      </w:r>
-      <w:r>
-        <w:t xml:space="preserve"> EXCLUSIVIDAD</w:t>
-      </w:r>
-    </w:p>
-    <w:p>
-      <w:pPr>
-        <w:spacing w:after="80"/>
-      </w:pPr>
-      <w:r>
-        <w:rPr>
-          <w:b/>
-        </w:rPr>
-        <w:t xml:space="preserve">Título (parte destacada en color):</w:t>
-      </w:r>
-      <w:r>
-        <w:t xml:space="preserve"> DE CATEGORÍA</w:t>
-      </w:r>
-    </w:p>
-    <w:p>
-      <w:pPr>
-        <w:spacing w:after="80"/>
-      </w:pPr>
-      <w:r>
-        <w:rPr>
-          <w:b/>
-        </w:rPr>
-        <w:t xml:space="preserve">Subtítulo:</w:t>
-      </w:r>
-      <w:r>
-        <w:t xml:space="preserve"> VOIT, el único balón de la Academia y de Liga Chitiva</w:t>
-      </w:r>
-    </w:p>
-    <w:p>
-      <w:pPr>
-        <w:pStyle w:val="Heading3"/>
-      </w:pPr>
-      <w:r>
-        <w:t xml:space="preserve">Texto</w:t>
-      </w:r>
-    </w:p>
-    <w:p>
-      <w:pPr>
-        <w:jc w:val="both"/>
-      </w:pPr>
-      <w:r>
-        <w:t xml:space="preserve">Durante la vigencia del convenio, VOIT será la marca única y exclusiva de balones de fútbol utilizada y promovida oficialmente por la Academia y Liga Chitiva dentro del Complejo Deportivo Andrés Chitiva.</w:t>
-      </w:r>
-    </w:p>
-    <w:p>
-      <w:pPr>
-        <w:pStyle w:val="Heading3"/>
-      </w:pPr>
-      <w:r>
-        <w:t xml:space="preserve">Viñetas</w:t>
-      </w:r>
-    </w:p>
-    <w:p>
-      <w:pPr>
-        <w:pStyle w:val="ListBullet"/>
-        <w:numPr>
-          <w:ilvl w:val="0"/>
-          <w:numId w:val="1"/>
-        </w:numPr>
-      </w:pPr>
-      <w:r>
-        <w:t xml:space="preserve">Balón exclusivo en entrenamientos, partidos, visorías, clínicas, torneos y eventos oficiales.</w:t>
-      </w:r>
-    </w:p>
-    <w:p>
-      <w:pPr>
-        <w:pStyle w:val="ListBullet"/>
-        <w:numPr>
-          <w:ilvl w:val="0"/>
-          <w:numId w:val="1"/>
-        </w:numPr>
-      </w:pPr>
-      <w:r>
-        <w:t xml:space="preserve">Balón oficial de juego de Liga Chitiva en todas sus categorías.</w:t>
-      </w:r>
-    </w:p>
-    <w:p>
-      <w:pPr>
-        <w:pStyle w:val="ListBullet"/>
-        <w:numPr>
-          <w:ilvl w:val="0"/>
-          <w:numId w:val="1"/>
-        </w:numPr>
-      </w:pPr>
-      <w:r>
-        <w:t xml:space="preserve">Sin balones de marcas competidoras en actividades oficiales, redes sociales ni material publicitario.</w:t>
-      </w:r>
-    </w:p>
-    <w:p>
-      <w:pPr>
-        <w:pStyle w:val="ListBullet"/>
-        <w:numPr>
-          <w:ilvl w:val="0"/>
-          <w:numId w:val="1"/>
-        </w:numPr>
-      </w:pPr>
-      <w:r>
-        <w:t xml:space="preserve">Sin convenios de patrocinio, canje, publicidad o proveeduría con marcas competidoras de balones.</w:t>
-      </w:r>
-    </w:p>
-    <w:p>
-      <w:pPr>
-        <w:spacing w:after="80"/>
-      </w:pPr>
-      <w:r>
-        <w:rPr>
-          <w:b/>
-        </w:rPr>
-        <w:t xml:space="preserve">Frase de cierre (cursiva):</w:t>
-      </w:r>
-      <w:r>
-        <w:t xml:space="preserve"> «La exclusividad podrá ampliarse a otras líneas de producto mediante acuerdo por escrito.»</w:t>
-      </w:r>
-    </w:p>
-    <w:p>
-      <w:pPr>
-        <w:spacing w:after="80"/>
-      </w:pPr>
-      <w:r>
-        <w:rPr>
-          <w:b/>
-        </w:rPr>
-        <w:t xml:space="preserve">Imagen sugerida:</w:t>
-      </w:r>
-      <w:r>
-        <w:t xml:space="preserve"> Balón VOIT en primer plano durante un partido o entrenamiento.</w:t>
-      </w:r>
-    </w:p>
-    <w:p>
-      <w:pPr>
-        <w:pStyle w:val="Heading1"/>
-      </w:pPr>
-      <w:r>
         <w:t xml:space="preserve">Slide 4 · Publicidad perimetral</w:t>
+      </w:r>
+    </w:p>
+    <w:p>
+      <w:pPr>
+        <w:spacing w:after="80"/>
+      </w:pPr>
+      <w:r>
+        <w:rPr>
+          <w:b/>
+        </w:rPr>
+        <w:t xml:space="preserve">Etiqueta superior (texto pequeño):</w:t>
+      </w:r>
+      <w:r>
+        <w:t xml:space="preserve"> Contraprestación 2 · Publicidad perimetral</w:t>
       </w:r>
     </w:p>
     <w:p>
@@ -1078,6 +1198,20 @@
         <w:rPr>
           <w:b/>
         </w:rPr>
+        <w:t xml:space="preserve">Etiqueta superior (texto pequeño):</w:t>
+      </w:r>
+      <w:r>
+        <w:t xml:space="preserve"> Contraprestación 2 · Publicidad perimetral</w:t>
+      </w:r>
+    </w:p>
+    <w:p>
+      <w:pPr>
+        <w:spacing w:after="80"/>
+      </w:pPr>
+      <w:r>
+        <w:rPr>
+          <w:b/>
+        </w:rPr>
         <w:t xml:space="preserve">Título:</w:t>
       </w:r>
       <w:r>
@@ -1222,6 +1356,20 @@
         <w:rPr>
           <w:b/>
         </w:rPr>
+        <w:t xml:space="preserve">Etiqueta superior (texto pequeño):</w:t>
+      </w:r>
+      <w:r>
+        <w:t xml:space="preserve"> Contraprestación 2 · Publicidad perimetral</w:t>
+      </w:r>
+    </w:p>
+    <w:p>
+      <w:pPr>
+        <w:spacing w:after="80"/>
+      </w:pPr>
+      <w:r>
+        <w:rPr>
+          <w:b/>
+        </w:rPr>
         <w:t xml:space="preserve">Título:</w:t>
       </w:r>
       <w:r>
@@ -1334,6 +1482,20 @@
         <w:rPr>
           <w:b/>
         </w:rPr>
+        <w:t xml:space="preserve">Etiqueta superior (texto pequeño):</w:t>
+      </w:r>
+      <w:r>
+        <w:t xml:space="preserve"> Contraprestación 2 · Publicidad perimetral</w:t>
+      </w:r>
+    </w:p>
+    <w:p>
+      <w:pPr>
+        <w:spacing w:after="80"/>
+      </w:pPr>
+      <w:r>
+        <w:rPr>
+          <w:b/>
+        </w:rPr>
         <w:t xml:space="preserve">Título:</w:t>
       </w:r>
       <w:r>
@@ -1466,6 +1628,20 @@
         <w:rPr>
           <w:b/>
         </w:rPr>
+        <w:t xml:space="preserve">Etiqueta superior (texto pequeño):</w:t>
+      </w:r>
+      <w:r>
+        <w:t xml:space="preserve"> Contraprestación 3 · Branding en uniformes</w:t>
+      </w:r>
+    </w:p>
+    <w:p>
+      <w:pPr>
+        <w:spacing w:after="80"/>
+      </w:pPr>
+      <w:r>
+        <w:rPr>
+          <w:b/>
+        </w:rPr>
         <w:t xml:space="preserve">Título:</w:t>
       </w:r>
       <w:r>
@@ -1580,6 +1756,20 @@
       </w:pPr>
       <w:r>
         <w:t xml:space="preserve">Slide 9 · Contenido digital</w:t>
+      </w:r>
+    </w:p>
+    <w:p>
+      <w:pPr>
+        <w:spacing w:after="80"/>
+      </w:pPr>
+      <w:r>
+        <w:rPr>
+          <w:b/>
+        </w:rPr>
+        <w:t xml:space="preserve">Etiqueta superior (texto pequeño):</w:t>
+      </w:r>
+      <w:r>
+        <w:t xml:space="preserve"> Contraprestación 4 · Contenido digital</w:t>
       </w:r>
     </w:p>
     <w:p>
@@ -1919,6 +2109,20 @@
         <w:rPr>
           <w:b/>
         </w:rPr>
+        <w:t xml:space="preserve">Etiqueta superior (texto pequeño):</w:t>
+      </w:r>
+      <w:r>
+        <w:t xml:space="preserve"> Contraprestación 4 · Contenido digital</w:t>
+      </w:r>
+    </w:p>
+    <w:p>
+      <w:pPr>
+        <w:spacing w:after="80"/>
+      </w:pPr>
+      <w:r>
+        <w:rPr>
+          <w:b/>
+        </w:rPr>
         <w:t xml:space="preserve">Título:</w:t>
       </w:r>
       <w:r>
@@ -2072,6 +2276,20 @@
         <w:rPr>
           <w:b/>
         </w:rPr>
+        <w:t xml:space="preserve">Etiqueta superior (texto pequeño):</w:t>
+      </w:r>
+      <w:r>
+        <w:t xml:space="preserve"> Contraprestación 5 · Denominación oficial, eventos y activaciones</w:t>
+      </w:r>
+    </w:p>
+    <w:p>
+      <w:pPr>
+        <w:spacing w:after="80"/>
+      </w:pPr>
+      <w:r>
+        <w:rPr>
+          <w:b/>
+        </w:rPr>
         <w:t xml:space="preserve">Título:</w:t>
       </w:r>
       <w:r>
@@ -2227,6 +2445,20 @@
       </w:pPr>
       <w:r>
         <w:t xml:space="preserve">Slide 12 · Activaciones presenciales</w:t>
+      </w:r>
+    </w:p>
+    <w:p>
+      <w:pPr>
+        <w:spacing w:after="80"/>
+      </w:pPr>
+      <w:r>
+        <w:rPr>
+          <w:b/>
+        </w:rPr>
+        <w:t xml:space="preserve">Etiqueta superior (texto pequeño):</w:t>
+      </w:r>
+      <w:r>
+        <w:t xml:space="preserve"> Contraprestación 5 · Denominación oficial, eventos y activaciones</w:t>
       </w:r>
     </w:p>
     <w:p>

</xml_diff>